<commit_message>
Align final report with reorganized repo
</commit_message>
<xml_diff>
--- a/submission/final_report_draft_formal.docx
+++ b/submission/final_report_draft_formal.docx
@@ -324,7 +324,7 @@
               <w:rPr>
                 <w:rFonts w:ascii="Malgun Gothic" w:hAnsi="Malgun Gothic" w:eastAsia="Malgun Gothic"/>
               </w:rPr>
-              <w:t xml:space="preserve">이동약자</w:t>
+              <w:t xml:space="preserve">교통약자</w:t>
             </w:r>
           </w:p>
         </w:tc>
@@ -2853,6 +2853,17 @@
           <w:rFonts w:ascii="Consolas" w:hAnsi="Consolas" w:eastAsia="Consolas"/>
         </w:rPr>
         <w:t xml:space="preserve">scripts/experiment1/configs/fusion.yaml</w:t>
+      </w:r>
+    </w:p>
+    <w:p>
+      <w:pPr>
+        <w:pStyle w:val="CodeBlock"/>
+      </w:pPr>
+      <w:r>
+        <w:rPr>
+          <w:rFonts w:ascii="Consolas" w:hAnsi="Consolas" w:eastAsia="Consolas"/>
+        </w:rPr>
+        <w:t xml:space="preserve">scripts/experiment1/configs/fusion_attention.yaml</w:t>
       </w:r>
     </w:p>
     <w:p>
@@ -4232,7 +4243,7 @@
         <w:rPr>
           <w:rFonts w:ascii="Malgun Gothic" w:hAnsi="Malgun Gothic" w:eastAsia="Malgun Gothic"/>
         </w:rPr>
-        <w:t xml:space="preserve">1차 실험에서 가장 높은 성능은 GT Keypoint 1D-CNN + GRU 모델의 test Macro F1 0.9497이었습니다. 이는 사람의 자세 정보가 이상행동 분류에 매우 강력한 특징임을 보여줍니다. 특히 전도, 폭행, 이동약자처럼 사람 자세와 움직임 변화가 중요한 class에서 keypoint 정보가 유리하게 작용했습니다.</w:t>
+        <w:t xml:space="preserve">1차 실험에서 가장 높은 성능은 GT Keypoint 1D-CNN + GRU 모델의 test Macro F1 0.9497이었습니다. 이는 사람의 자세 정보가 이상행동 분류에 매우 강력한 특징임을 보여줍니다. 특히 전도, 폭행, 교통약자처럼 사람 자세와 움직임 변화가 중요한 class에서 keypoint 정보가 유리하게 작용했습니다.</w:t>
       </w:r>
     </w:p>
     <w:p>

</xml_diff>